<commit_message>
Add clickable hyperlinks to v2 references
Co-Authored-By: Claude Sonnet 5.5 <noreply@anthropic.com>
Claude-Session: https://claude.ai/code/session_01VZidmmhujRruZpCzGxxfHL
</commit_message>
<xml_diff>
--- a/cw4_v2/CW4_UrbanStay_Report_v2.docx
+++ b/cw4_v2/CW4_UrbanStay_Report_v2.docx
@@ -1377,7 +1377,28 @@
           <w:sz w:val="22"/>
           <w:szCs w:val="22"/>
         </w:rPr>
-        <w:t xml:space="preserve">, 56(6), pp. 137-142.</w:t>
+        <w:t xml:space="preserve">, 56(6), pp. 137-142. Available at: </w:t>
+      </w:r>
+      <w:hyperlink w:history="1" r:id="rId0d61uxxecz4z1ysiftm2a">
+        <w:r>
+          <w:rPr>
+            <w:rStyle w:val="Hyperlink"/>
+            <w:rFonts w:ascii="Arial" w:cs="Arial" w:eastAsia="Arial" w:hAnsi="Arial"/>
+            <w:color w:val="0563C1"/>
+            <w:sz w:val="22"/>
+            <w:szCs w:val="22"/>
+            <w:u w:val="single"/>
+          </w:rPr>
+          <w:t xml:space="preserve">https://hbr.org/1978/11/where-does-the-customer-fit-in-a-service-operation</w:t>
+        </w:r>
+      </w:hyperlink>
+      <w:r>
+        <w:rPr>
+          <w:rFonts w:ascii="Arial" w:cs="Arial" w:eastAsia="Arial" w:hAnsi="Arial"/>
+          <w:sz w:val="22"/>
+          <w:szCs w:val="22"/>
+        </w:rPr>
+        <w:t xml:space="preserve"> (Accessed: 8 October 2026).</w:t>
       </w:r>
     </w:p>
     <w:p>
@@ -1410,7 +1431,28 @@
           <w:sz w:val="22"/>
           <w:szCs w:val="22"/>
         </w:rPr>
-        <w:t xml:space="preserve">, 84(11), pp. 92-101.</w:t>
+        <w:t xml:space="preserve">, 84(11), pp. 92-101. Available at: </w:t>
+      </w:r>
+      <w:hyperlink w:history="1" r:id="rIdwre7wdkt4mirp8160tkyb">
+        <w:r>
+          <w:rPr>
+            <w:rStyle w:val="Hyperlink"/>
+            <w:rFonts w:ascii="Arial" w:cs="Arial" w:eastAsia="Arial" w:hAnsi="Arial"/>
+            <w:color w:val="0563C1"/>
+            <w:sz w:val="22"/>
+            <w:szCs w:val="22"/>
+            <w:u w:val="single"/>
+          </w:rPr>
+          <w:t xml:space="preserve">https://hbr.org/2006/11/breaking-the-trade-off-between-efficiency-and-service</w:t>
+        </w:r>
+      </w:hyperlink>
+      <w:r>
+        <w:rPr>
+          <w:rFonts w:ascii="Arial" w:cs="Arial" w:eastAsia="Arial" w:hAnsi="Arial"/>
+          <w:sz w:val="22"/>
+          <w:szCs w:val="22"/>
+        </w:rPr>
+        <w:t xml:space="preserve"> (Accessed: 8 October 2026).</w:t>
       </w:r>
     </w:p>
     <w:p>
@@ -1509,7 +1551,28 @@
           <w:sz w:val="22"/>
           <w:szCs w:val="22"/>
         </w:rPr>
-        <w:t xml:space="preserve">. 3rd edn. Melbourne: OTexts. Available at: https://otexts.com/fpp3/ (Accessed: 8 October 2026).</w:t>
+        <w:t xml:space="preserve">. 3rd edn. Melbourne: OTexts. Available at: </w:t>
+      </w:r>
+      <w:hyperlink w:history="1" r:id="rIdu8stwbi_oaz_pf1wwvubs">
+        <w:r>
+          <w:rPr>
+            <w:rStyle w:val="Hyperlink"/>
+            <w:rFonts w:ascii="Arial" w:cs="Arial" w:eastAsia="Arial" w:hAnsi="Arial"/>
+            <w:color w:val="0563C1"/>
+            <w:sz w:val="22"/>
+            <w:szCs w:val="22"/>
+            <w:u w:val="single"/>
+          </w:rPr>
+          <w:t xml:space="preserve">https://otexts.com/fpp3/</w:t>
+        </w:r>
+      </w:hyperlink>
+      <w:r>
+        <w:rPr>
+          <w:rFonts w:ascii="Arial" w:cs="Arial" w:eastAsia="Arial" w:hAnsi="Arial"/>
+          <w:sz w:val="22"/>
+          <w:szCs w:val="22"/>
+        </w:rPr>
+        <w:t xml:space="preserve"> (Accessed: 8 October 2026).</w:t>
       </w:r>
     </w:p>
     <w:p>
@@ -1608,7 +1671,28 @@
           <w:sz w:val="22"/>
           <w:szCs w:val="22"/>
         </w:rPr>
-        <w:t xml:space="preserve">, 62(1), pp. 133-139.</w:t>
+        <w:t xml:space="preserve">, 62(1), pp. 133-139. Available at: </w:t>
+      </w:r>
+      <w:hyperlink w:history="1" r:id="rIdibi5zs0lefzsaybmpo4jy">
+        <w:r>
+          <w:rPr>
+            <w:rStyle w:val="Hyperlink"/>
+            <w:rFonts w:ascii="Arial" w:cs="Arial" w:eastAsia="Arial" w:hAnsi="Arial"/>
+            <w:color w:val="0563C1"/>
+            <w:sz w:val="22"/>
+            <w:szCs w:val="22"/>
+            <w:u w:val="single"/>
+          </w:rPr>
+          <w:t xml:space="preserve">https://hbr.org/1984/01/designing-services-that-deliver</w:t>
+        </w:r>
+      </w:hyperlink>
+      <w:r>
+        <w:rPr>
+          <w:rFonts w:ascii="Arial" w:cs="Arial" w:eastAsia="Arial" w:hAnsi="Arial"/>
+          <w:sz w:val="22"/>
+          <w:szCs w:val="22"/>
+        </w:rPr>
+        <w:t xml:space="preserve"> (Accessed: 8 October 2026).</w:t>
       </w:r>
     </w:p>
     <w:p>
@@ -1740,7 +1824,28 @@
           <w:sz w:val="22"/>
           <w:szCs w:val="22"/>
         </w:rPr>
-        <w:t xml:space="preserve">, 19(3), pp. 401-415.</w:t>
+        <w:t xml:space="preserve">, 19(3), pp. 401-415. Available at: </w:t>
+      </w:r>
+      <w:hyperlink w:history="1" r:id="rIdvj6xzucot9cl87ye_dswj">
+        <w:r>
+          <w:rPr>
+            <w:rStyle w:val="Hyperlink"/>
+            <w:rFonts w:ascii="Arial" w:cs="Arial" w:eastAsia="Arial" w:hAnsi="Arial"/>
+            <w:color w:val="0563C1"/>
+            <w:sz w:val="22"/>
+            <w:szCs w:val="22"/>
+            <w:u w:val="single"/>
+          </w:rPr>
+          <w:t xml:space="preserve">https://doi.org/10.1016/S0169-2070(02)00011-0</w:t>
+        </w:r>
+      </w:hyperlink>
+      <w:r>
+        <w:rPr>
+          <w:rFonts w:ascii="Arial" w:cs="Arial" w:eastAsia="Arial" w:hAnsi="Arial"/>
+          <w:sz w:val="22"/>
+          <w:szCs w:val="22"/>
+        </w:rPr>
+        <w:t xml:space="preserve"> (Accessed: 8 October 2026).</w:t>
       </w:r>
     </w:p>
     <w:p>
@@ -1773,7 +1878,28 @@
           <w:sz w:val="22"/>
           <w:szCs w:val="22"/>
         </w:rPr>
-        <w:t xml:space="preserve">. Available at: https://www.whitbread.com (Accessed: 8 October 2026).</w:t>
+        <w:t xml:space="preserve">. Available at: </w:t>
+      </w:r>
+      <w:hyperlink w:history="1" r:id="rIdc2wcvxhbvjbazbmms_v3n">
+        <w:r>
+          <w:rPr>
+            <w:rStyle w:val="Hyperlink"/>
+            <w:rFonts w:ascii="Arial" w:cs="Arial" w:eastAsia="Arial" w:hAnsi="Arial"/>
+            <w:color w:val="0563C1"/>
+            <w:sz w:val="22"/>
+            <w:szCs w:val="22"/>
+            <w:u w:val="single"/>
+          </w:rPr>
+          <w:t xml:space="preserve">https://www.whitbread.com</w:t>
+        </w:r>
+      </w:hyperlink>
+      <w:r>
+        <w:rPr>
+          <w:rFonts w:ascii="Arial" w:cs="Arial" w:eastAsia="Arial" w:hAnsi="Arial"/>
+          <w:sz w:val="22"/>
+          <w:szCs w:val="22"/>
+        </w:rPr>
+        <w:t xml:space="preserve"> (Accessed: 8 October 2026).</w:t>
       </w:r>
     </w:p>
     <w:p>
@@ -1806,7 +1932,28 @@
           <w:sz w:val="22"/>
           <w:szCs w:val="22"/>
         </w:rPr>
-        <w:t xml:space="preserve">, 43, pp. 1-12.</w:t>
+        <w:t xml:space="preserve">, 43, pp. 1-12. Available at: </w:t>
+      </w:r>
+      <w:hyperlink w:history="1" r:id="rIdemv4z0_htn2-m_doqczyw">
+        <w:r>
+          <w:rPr>
+            <w:rStyle w:val="Hyperlink"/>
+            <w:rFonts w:ascii="Arial" w:cs="Arial" w:eastAsia="Arial" w:hAnsi="Arial"/>
+            <w:color w:val="0563C1"/>
+            <w:sz w:val="22"/>
+            <w:szCs w:val="22"/>
+            <w:u w:val="single"/>
+          </w:rPr>
+          <w:t xml:space="preserve">https://doi.org/10.1016/j.ijhm.2014.07.007</w:t>
+        </w:r>
+      </w:hyperlink>
+      <w:r>
+        <w:rPr>
+          <w:rFonts w:ascii="Arial" w:cs="Arial" w:eastAsia="Arial" w:hAnsi="Arial"/>
+          <w:sz w:val="22"/>
+          <w:szCs w:val="22"/>
+        </w:rPr>
+        <w:t xml:space="preserve"> (Accessed: 8 October 2026).</w:t>
       </w:r>
     </w:p>
     <w:p>
@@ -1839,7 +1986,28 @@
           <w:sz w:val="22"/>
           <w:szCs w:val="22"/>
         </w:rPr>
-        <w:t xml:space="preserve">, 27(1), pp. 108-131.</w:t>
+        <w:t xml:space="preserve">, 27(1), pp. 108-131. Available at: </w:t>
+      </w:r>
+      <w:hyperlink w:history="1" r:id="rId3z86snl3mzld_bjt1gyzl">
+        <w:r>
+          <w:rPr>
+            <w:rStyle w:val="Hyperlink"/>
+            <w:rFonts w:ascii="Arial" w:cs="Arial" w:eastAsia="Arial" w:hAnsi="Arial"/>
+            <w:color w:val="0563C1"/>
+            <w:sz w:val="22"/>
+            <w:szCs w:val="22"/>
+            <w:u w:val="single"/>
+          </w:rPr>
+          <w:t xml:space="preserve">https://doi.org/10.1108/01443570710714556</w:t>
+        </w:r>
+      </w:hyperlink>
+      <w:r>
+        <w:rPr>
+          <w:rFonts w:ascii="Arial" w:cs="Arial" w:eastAsia="Arial" w:hAnsi="Arial"/>
+          <w:sz w:val="22"/>
+          <w:szCs w:val="22"/>
+        </w:rPr>
+        <w:t xml:space="preserve"> (Accessed: 8 October 2026).</w:t>
       </w:r>
     </w:p>
     <w:p>

</xml_diff>